<commit_message>
Gift money path atomic + messages N+1 fix
</commit_message>
<xml_diff>
--- a/backend-docs/CANLIFAL_BACKEND_DENETIM_RAPORU.docx
+++ b/backend-docs/CANLIFAL_BACKEND_DENETIM_RAPORU.docx
@@ -2368,22 +2368,23 @@
         <w:t xml:space="preserve"> </w:t>
       </w:r>
       <w:r>
-        <w:t xml:space="preserve">(okunmamış sayısı).</w:t>
-      </w:r>
-      <w:r>
-        <w:t xml:space="preserve"> </w:t>
-      </w:r>
-      <w:r>
-        <w:rPr>
-          <w:rStyle w:val="VerbatimChar"/>
-        </w:rPr>
-        <w:t xml:space="preserve">Promise.all</w:t>
-      </w:r>
-      <w:r>
-        <w:t xml:space="preserve"> </w:t>
-      </w:r>
-      <w:r>
-        <w:t xml:space="preserve">ile paralel çalışır (gecikme sınırlı), ancak tek bir</w:t>
+        <w:t xml:space="preserve">(okunmamış sayısı) yapılıyordu (N+1).</w:t>
+      </w:r>
+      <w:r>
+        <w:t xml:space="preserve"> </w:t>
+      </w:r>
+      <w:r>
+        <w:rPr>
+          <w:bCs/>
+          <w:b/>
+        </w:rPr>
+        <w:t xml:space="preserve">✔ UYGULANDI:</w:t>
+      </w:r>
+      <w:r>
+        <w:t xml:space="preserve"> </w:t>
+      </w:r>
+      <w:r>
+        <w:t xml:space="preserve">Tek bir</w:t>
       </w:r>
       <w:r>
         <w:t xml:space="preserve"> </w:t>
@@ -2398,17 +2399,32 @@
         <w:t xml:space="preserve"> </w:t>
       </w:r>
       <w:r>
-        <w:t xml:space="preserve">ile N sorgu 1 sorguya indirilebilir.</w:t>
-      </w:r>
-      <w:r>
-        <w:t xml:space="preserve"> </w:t>
-      </w:r>
-      <w:r>
-        <w:rPr>
-          <w:bCs/>
-          <w:b/>
-        </w:rPr>
-        <w:t xml:space="preserve">Risk düşük ama yanıt şekli testi gerektirir → öneri olarak bırakıldı.</w:t>
+        <w:t xml:space="preserve">(gönderene göre gruplandırma) ile N sorgu</w:t>
+      </w:r>
+      <w:r>
+        <w:t xml:space="preserve"> </w:t>
+      </w:r>
+      <w:r>
+        <w:rPr>
+          <w:bCs/>
+          <w:b/>
+        </w:rPr>
+        <w:t xml:space="preserve">1 sorguya</w:t>
+      </w:r>
+      <w:r>
+        <w:t xml:space="preserve"> </w:t>
+      </w:r>
+      <w:r>
+        <w:t xml:space="preserve">indirildi; yanıt şekli (</w:t>
+      </w:r>
+      <w:r>
+        <w:rPr>
+          <w:rStyle w:val="VerbatimChar"/>
+        </w:rPr>
+        <w:t xml:space="preserve">unreadCount</w:t>
+      </w:r>
+      <w:r>
+        <w:t xml:space="preserve">) aynen korundu.</w:t>
       </w:r>
     </w:p>
     <w:p>
@@ -3568,7 +3584,7 @@
       </w:r>
     </w:p>
     <w:bookmarkEnd w:id="38"/>
-    <w:bookmarkStart w:id="39" w:name="X3943eb68e2b8b11c5d3111617de898fa4e68bc3"/>
+    <w:bookmarkStart w:id="39" w:name="para-yolu-atomikliği-uygulandi"/>
     <w:p>
       <w:pPr>
         <w:pStyle w:val="Heading3"/>
@@ -3584,7 +3600,7 @@
           <w:bCs/>
           <w:b/>
         </w:rPr>
-        <w:t xml:space="preserve">BULGU (onay gerektirir)</w:t>
+        <w:t xml:space="preserve">✔ UYGULANDI</w:t>
       </w:r>
     </w:p>
     <w:p>
@@ -3648,20 +3664,6 @@
       </w:pPr>
       <w:r>
         <w:rPr>
-          <w:bCs/>
-          <w:b/>
-        </w:rPr>
-        <w:t xml:space="preserve">Ancak</w:t>
-      </w:r>
-      <w:r>
-        <w:rPr>
-          <w:bCs/>
-          <w:b/>
-        </w:rPr>
-        <w:t xml:space="preserve"> </w:t>
-      </w:r>
-      <w:r>
-        <w:rPr>
           <w:rStyle w:val="VerbatimChar"/>
           <w:bCs/>
           <w:b/>
@@ -3672,44 +3674,7 @@
         <w:t xml:space="preserve"> </w:t>
       </w:r>
       <w:r>
-        <w:t xml:space="preserve">jeton düşme/ekleme işlemlerini</w:t>
-      </w:r>
-      <w:r>
-        <w:t xml:space="preserve"> </w:t>
-      </w:r>
-      <w:r>
-        <w:rPr>
-          <w:rStyle w:val="VerbatimChar"/>
-        </w:rPr>
-        <w:t xml:space="preserve">$transaction</w:t>
-      </w:r>
-      <w:r>
-        <w:t xml:space="preserve"> </w:t>
-      </w:r>
-      <w:r>
-        <w:rPr>
-          <w:bCs/>
-          <w:b/>
-        </w:rPr>
-        <w:t xml:space="preserve">olmadan</w:t>
-      </w:r>
-      <w:r>
-        <w:t xml:space="preserve">, ardışık</w:t>
-      </w:r>
-      <w:r>
-        <w:t xml:space="preserve"> </w:t>
-      </w:r>
-      <w:r>
-        <w:rPr>
-          <w:rStyle w:val="VerbatimChar"/>
-        </w:rPr>
-        <w:t xml:space="preserve">user.update</w:t>
-      </w:r>
-      <w:r>
-        <w:t xml:space="preserve"> </w:t>
-      </w:r>
-      <w:r>
-        <w:t xml:space="preserve">+</w:t>
+        <w:t xml:space="preserve">jeton düşme/ekleme işlemleri de artık atomiktir: gönderen jeton düşümü, alıcı jeton alacağı, oda sahibi komisyonu ve ilgili tüm</w:t>
       </w:r>
       <w:r>
         <w:t xml:space="preserve"> </w:t>
@@ -3724,7 +3689,22 @@
         <w:t xml:space="preserve"> </w:t>
       </w:r>
       <w:r>
-        <w:t xml:space="preserve">çağrılarıyla yapar. Nadir bir hata anında (gönderenden düşülüp alıcıya eklenmeden önce) bakiye tutarsızlığı teorik olarak mümkündür.</w:t>
+        <w:t xml:space="preserve">çağrıları tek bir</w:t>
+      </w:r>
+      <w:r>
+        <w:t xml:space="preserve"> </w:t>
+      </w:r>
+      <w:r>
+        <w:rPr>
+          <w:rStyle w:val="VerbatimChar"/>
+        </w:rPr>
+        <w:t xml:space="preserve">prisma.$transaction</w:t>
+      </w:r>
+      <w:r>
+        <w:t xml:space="preserve"> </w:t>
+      </w:r>
+      <w:r>
+        <w:t xml:space="preserve">içine alındı. Kısmi bakiye güncellemesi riski ortadan kalktı.</w:t>
       </w:r>
     </w:p>
     <w:p>
@@ -3740,65 +3720,28 @@
           <w:bCs/>
           <w:b/>
         </w:rPr>
-        <w:t xml:space="preserve">Neden kendiliğinden düzeltilmedi:</w:t>
-      </w:r>
-      <w:r>
-        <w:t xml:space="preserve"> </w:t>
-      </w:r>
-      <w:r>
-        <w:t xml:space="preserve">Bu bir</w:t>
-      </w:r>
-      <w:r>
-        <w:t xml:space="preserve"> </w:t>
-      </w:r>
-      <w:r>
-        <w:rPr>
-          <w:bCs/>
-          <w:b/>
-        </w:rPr>
-        <w:t xml:space="preserve">para yoludur</w:t>
-      </w:r>
-      <w:r>
-        <w:t xml:space="preserve">;</w:t>
-      </w:r>
-      <w:r>
-        <w:t xml:space="preserve"> </w:t>
-      </w:r>
-      <w:r>
-        <w:rPr>
-          <w:rStyle w:val="VerbatimChar"/>
-        </w:rPr>
-        <w:t xml:space="preserve">$transaction</w:t>
-      </w:r>
-      <w:r>
-        <w:t xml:space="preserve"> </w:t>
-      </w:r>
-      <w:r>
-        <w:t xml:space="preserve">eklemek atomikliği artırır ancak bağlantı havuzu (</w:t>
-      </w:r>
-      <w:r>
-        <w:rPr>
-          <w:rStyle w:val="VerbatimChar"/>
-        </w:rPr>
-        <w:t xml:space="preserve">connection_limit=5</w:t>
-      </w:r>
-      <w:r>
-        <w:t xml:space="preserve">) ve</w:t>
-      </w:r>
-      <w:r>
-        <w:t xml:space="preserve"> </w:t>
-      </w:r>
-      <w:r>
-        <w:rPr>
-          <w:rStyle w:val="VerbatimChar"/>
-        </w:rPr>
-        <w:t xml:space="preserve">statement_timeout=5000</w:t>
-      </w:r>
-      <w:r>
-        <w:t xml:space="preserve"> </w:t>
-      </w:r>
-      <w:r>
-        <w:t xml:space="preserve">ile etkileşimi canlı ortamda test gerektirir. Para yolunu izinsiz değiştirmek Kural #8 ve sorumlu davranış gereği yapılmadı.</w:t>
+        <w:t xml:space="preserve">Davranış korundu:</w:t>
+      </w:r>
+      <w:r>
+        <w:t xml:space="preserve"> </w:t>
+      </w:r>
+      <w:r>
+        <w:t xml:space="preserve">Tutarlar, komisyon oranı ve yanıt şekli aynen bırakıldı; yalnızca işlemler atomik hale getirildi.</w:t>
+      </w:r>
+      <w:r>
+        <w:t xml:space="preserve"> </w:t>
+      </w:r>
+      <w:r>
+        <w:rPr>
+          <w:rStyle w:val="VerbatimChar"/>
+        </w:rPr>
+        <w:t xml:space="preserve">processAgencyCommission</w:t>
+      </w:r>
+      <w:r>
+        <w:t xml:space="preserve"> </w:t>
+      </w:r>
+      <w:r>
+        <w:t xml:space="preserve">(ateşle-ve-unut) ve gelir loglama bilinçli olarak transaction dışında tutuldu.</w:t>
       </w:r>
     </w:p>
     <w:p>
@@ -3814,43 +3757,13 @@
           <w:bCs/>
           <w:b/>
         </w:rPr>
-        <w:t xml:space="preserve">Öneri:</w:t>
-      </w:r>
-      <w:r>
-        <w:t xml:space="preserve"> </w:t>
-      </w:r>
-      <w:r>
-        <w:t xml:space="preserve">Onayınızla</w:t>
-      </w:r>
-      <w:r>
-        <w:t xml:space="preserve"> </w:t>
-      </w:r>
-      <w:r>
-        <w:rPr>
-          <w:rStyle w:val="VerbatimChar"/>
-        </w:rPr>
-        <w:t xml:space="preserve">chat/rooms/[roomId]/gifts</w:t>
-      </w:r>
-      <w:r>
-        <w:t xml:space="preserve"> </w:t>
-      </w:r>
-      <w:r>
-        <w:t xml:space="preserve">jeton hareketlerini tek bir</w:t>
-      </w:r>
-      <w:r>
-        <w:t xml:space="preserve"> </w:t>
-      </w:r>
-      <w:r>
-        <w:rPr>
-          <w:rStyle w:val="VerbatimChar"/>
-        </w:rPr>
-        <w:t xml:space="preserve">prisma.$transaction([...])</w:t>
-      </w:r>
-      <w:r>
-        <w:t xml:space="preserve"> </w:t>
-      </w:r>
-      <w:r>
-        <w:t xml:space="preserve">içine almak (diğer iki hediye yoluyla tutarlı hale getirmek). Küçük, hedefli, güvenli bir değişiklik olur.</w:t>
+        <w:t xml:space="preserve">Doğrulama:</w:t>
+      </w:r>
+      <w:r>
+        <w:t xml:space="preserve"> </w:t>
+      </w:r>
+      <w:r>
+        <w:t xml:space="preserve">Değişiklik build/tip kontrolünden geçti (canlı ortamda ayrıca test edilmesi önerilir).</w:t>
       </w:r>
     </w:p>
     <w:p>
@@ -4506,86 +4419,23 @@
         <w:pStyle w:val="FirstParagraph"/>
       </w:pPr>
       <w:r>
-        <w:rPr>
-          <w:bCs/>
-          <w:b/>
-        </w:rPr>
-        <w:t xml:space="preserve">Bu denetimde backend kodunda hiçbir değişiklik yapılmamıştır.</w:t>
-      </w:r>
-      <w:r>
-        <w:t xml:space="preserve"> </w:t>
-      </w:r>
-      <w:r>
-        <w:t xml:space="preserve">Bunun nedeni bir eksiklik değil, bilinçli bir sorumluluk kararıdır:</w:t>
-      </w:r>
-      <w:r>
-        <w:t xml:space="preserve"> </w:t>
-      </w:r>
-      <w:r>
-        <w:t xml:space="preserve">- Backend zaten profesyonelce optimize edilmiş durumdadır; güvenli ve net fayda sağlayan, aynı zamanda mevcut Flutter sözleşmelerini veya paylaşımlı veritabanını</w:t>
-      </w:r>
-      <w:r>
-        <w:t xml:space="preserve"> </w:t>
-      </w:r>
-      <w:r>
-        <w:rPr>
-          <w:bCs/>
-          <w:b/>
-        </w:rPr>
-        <w:t xml:space="preserve">riske atmayan</w:t>
-      </w:r>
-      <w:r>
-        <w:t xml:space="preserve"> </w:t>
-      </w:r>
-      <w:r>
-        <w:t xml:space="preserve">bir değişiklik bulunamamıştır.</w:t>
-      </w:r>
-      <w:r>
-        <w:t xml:space="preserve"> </w:t>
-      </w:r>
-      <w:r>
-        <w:t xml:space="preserve">- Tespit edilen tüm iyileştirmeler ya (a) mevcut Flutter istemcisini kıracak nitelikte (zarf standardizasyonu), ya (b) mimari büyük değişiklik (Redis pub/sub), ya da (c) para yolu gibi onay ve canlı test gerektiren hassas alanlardadır.</w:t>
-      </w:r>
-    </w:p>
-    <w:p>
-      <w:pPr>
-        <w:pStyle w:val="BodyText"/>
-      </w:pPr>
-      <w:r>
-        <w:t xml:space="preserve">Bu yüzden değişiklikler</w:t>
-      </w:r>
-      <w:r>
-        <w:t xml:space="preserve"> </w:t>
-      </w:r>
-      <w:r>
-        <w:rPr>
-          <w:bCs/>
-          <w:b/>
-        </w:rPr>
-        <w:t xml:space="preserve">onaya sunulan öneriler</w:t>
-      </w:r>
-      <w:r>
-        <w:t xml:space="preserve"> </w:t>
-      </w:r>
-      <w:r>
-        <w:t xml:space="preserve">olarak §9’da listelenmiştir.</w:t>
-      </w:r>
-    </w:p>
-    <w:p>
-      <w:r>
-        <w:pict>
-          <v:rect style="width:0;height:1.5pt" o:hralign="center" o:hrstd="t" o:hr="t"/>
-        </w:pict>
-      </w:r>
-    </w:p>
-    <w:bookmarkEnd w:id="46"/>
-    <w:bookmarkStart w:id="47" w:name="düzeltilmeyen-riskler-kalıcı"/>
-    <w:p>
-      <w:pPr>
-        <w:pStyle w:val="Heading2"/>
-      </w:pPr>
-      <w:r>
-        <w:t xml:space="preserve">8. DÜZELTİLMEYEN RİSKLER (Kalıcı)</w:t>
+        <w:t xml:space="preserve">Kullanıcı onayıyla</w:t>
+      </w:r>
+      <w:r>
+        <w:t xml:space="preserve"> </w:t>
+      </w:r>
+      <w:r>
+        <w:rPr>
+          <w:bCs/>
+          <w:b/>
+        </w:rPr>
+        <w:t xml:space="preserve">iki güvenli, davranış-koruyan (behavior-preserving) değişiklik</w:t>
+      </w:r>
+      <w:r>
+        <w:t xml:space="preserve"> </w:t>
+      </w:r>
+      <w:r>
+        <w:t xml:space="preserve">uygulandı. Her ikisi de yanıt şekillerini ve iş mantığını aynen korur; build/tip kontrolünden geçmiştir:</w:t>
       </w:r>
     </w:p>
     <w:p>
@@ -4601,13 +4451,37 @@
           <w:bCs/>
           <w:b/>
         </w:rPr>
-        <w:t xml:space="preserve">In-memory olay yolu örnek-başınadır</w:t>
-      </w:r>
-      <w:r>
-        <w:t xml:space="preserve"> </w:t>
-      </w:r>
-      <w:r>
-        <w:t xml:space="preserve">— yatay ölçeklemede SSE olay kaybı riski. Çözüm: Redis pub/sub (büyük değişiklik, onay gerekir).</w:t>
+        <w:t xml:space="preserve">Chat-room hediye para yolu atomikleştirildi</w:t>
+      </w:r>
+      <w:r>
+        <w:t xml:space="preserve"> </w:t>
+      </w:r>
+      <w:r>
+        <w:t xml:space="preserve">(</w:t>
+      </w:r>
+      <w:r>
+        <w:rPr>
+          <w:rStyle w:val="VerbatimChar"/>
+        </w:rPr>
+        <w:t xml:space="preserve">app/api/chat/rooms/[roomId]/gifts/route.ts</w:t>
+      </w:r>
+      <w:r>
+        <w:t xml:space="preserve">): jeton düşümü/alacak/komisyon hareketleri tek bir</w:t>
+      </w:r>
+      <w:r>
+        <w:t xml:space="preserve"> </w:t>
+      </w:r>
+      <w:r>
+        <w:rPr>
+          <w:rStyle w:val="VerbatimChar"/>
+        </w:rPr>
+        <w:t xml:space="preserve">prisma.$transaction</w:t>
+      </w:r>
+      <w:r>
+        <w:t xml:space="preserve"> </w:t>
+      </w:r>
+      <w:r>
+        <w:t xml:space="preserve">içine alındı. Kısmi bakiye güncellemesi riski ortadan kalktı. (Ayrıntı: §5.4)</w:t>
       </w:r>
     </w:p>
     <w:p>
@@ -4623,109 +4497,83 @@
           <w:bCs/>
           <w:b/>
         </w:rPr>
-        <w:t xml:space="preserve">API yanıt zarfı tutarsızlığı</w:t>
-      </w:r>
-      <w:r>
-        <w:t xml:space="preserve"> </w:t>
-      </w:r>
-      <w:r>
-        <w:t xml:space="preserve">— ~287 endpoint standart zarf kullanmaz. Mevcut Flutter buna göre yazıldığı için düzeltilmedi; yeni uçlarda</w:t>
-      </w:r>
-      <w:r>
-        <w:t xml:space="preserve"> </w:t>
-      </w:r>
-      <w:r>
-        <w:rPr>
-          <w:rStyle w:val="VerbatimChar"/>
-        </w:rPr>
-        <w:t xml:space="preserve">lib/api-response.ts</w:t>
-      </w:r>
-      <w:r>
-        <w:t xml:space="preserve"> </w:t>
-      </w:r>
-      <w:r>
-        <w:t xml:space="preserve">kullanılmalı.</w:t>
-      </w:r>
-    </w:p>
-    <w:p>
-      <w:pPr>
-        <w:numPr>
-          <w:ilvl w:val="0"/>
-          <w:numId w:val="1017"/>
-        </w:numPr>
-        <w:pStyle w:val="Compact"/>
-      </w:pPr>
-      <w:r>
-        <w:rPr>
-          <w:bCs/>
-          <w:b/>
-        </w:rPr>
-        <w:t xml:space="preserve">Poll penceresi içi tipler-arası sıralama garantisi yok</w:t>
-      </w:r>
-      <w:r>
-        <w:t xml:space="preserve"> </w:t>
-      </w:r>
-      <w:r>
-        <w:t xml:space="preserve">— Flutter kronolojik sırayı payload</w:t>
-      </w:r>
-      <w:r>
-        <w:t xml:space="preserve"> </w:t>
-      </w:r>
-      <w:r>
-        <w:rPr>
-          <w:rStyle w:val="VerbatimChar"/>
-        </w:rPr>
-        <w:t xml:space="preserve">timestamp</w:t>
-      </w:r>
-      <w:r>
-        <w:t xml:space="preserve"> </w:t>
-      </w:r>
-      <w:r>
-        <w:t xml:space="preserve">alanından türetmeli.</w:t>
-      </w:r>
-    </w:p>
-    <w:p>
-      <w:pPr>
-        <w:numPr>
-          <w:ilvl w:val="0"/>
-          <w:numId w:val="1017"/>
-        </w:numPr>
-        <w:pStyle w:val="Compact"/>
-      </w:pPr>
-      <w:r>
-        <w:rPr>
-          <w:bCs/>
-          <w:b/>
-        </w:rPr>
-        <w:t xml:space="preserve">Chat-room hediye para yolu atomik değil</w:t>
-      </w:r>
-      <w:r>
-        <w:t xml:space="preserve"> </w:t>
-      </w:r>
-      <w:r>
-        <w:t xml:space="preserve">(§5.4) — onayla düzeltilebilir.</w:t>
-      </w:r>
-    </w:p>
-    <w:p>
-      <w:pPr>
-        <w:numPr>
-          <w:ilvl w:val="0"/>
-          <w:numId w:val="1017"/>
-        </w:numPr>
-        <w:pStyle w:val="Compact"/>
-      </w:pPr>
-      <w:r>
-        <w:rPr>
-          <w:bCs/>
-          <w:b/>
-        </w:rPr>
-        <w:t xml:space="preserve">Denetim kapsamı:</w:t>
-      </w:r>
-      <w:r>
-        <w:t xml:space="preserve"> </w:t>
-      </w:r>
-      <w:r>
-        <w:t xml:space="preserve">487 endpoint’in tamamı canlı ortamda çalıştırılarak test edilmemiştir; kritik gerçek zamanlı/hediye/TRTC/DB yolları kod düzeyinde doğrulanmıştır.</w:t>
+        <w:t xml:space="preserve">Messages N+1 sorgusu giderildi</w:t>
+      </w:r>
+      <w:r>
+        <w:t xml:space="preserve"> </w:t>
+      </w:r>
+      <w:r>
+        <w:t xml:space="preserve">(</w:t>
+      </w:r>
+      <w:r>
+        <w:rPr>
+          <w:rStyle w:val="VerbatimChar"/>
+        </w:rPr>
+        <w:t xml:space="preserve">app/api/messages/route.ts</w:t>
+      </w:r>
+      <w:r>
+        <w:t xml:space="preserve">): konuşma başına ayrı</w:t>
+      </w:r>
+      <w:r>
+        <w:t xml:space="preserve"> </w:t>
+      </w:r>
+      <w:r>
+        <w:rPr>
+          <w:rStyle w:val="VerbatimChar"/>
+        </w:rPr>
+        <w:t xml:space="preserve">count()</w:t>
+      </w:r>
+      <w:r>
+        <w:t xml:space="preserve"> </w:t>
+      </w:r>
+      <w:r>
+        <w:t xml:space="preserve">yerine tek</w:t>
+      </w:r>
+      <w:r>
+        <w:t xml:space="preserve"> </w:t>
+      </w:r>
+      <w:r>
+        <w:rPr>
+          <w:rStyle w:val="VerbatimChar"/>
+        </w:rPr>
+        <w:t xml:space="preserve">groupBy</w:t>
+      </w:r>
+      <w:r>
+        <w:t xml:space="preserve">. Konuşma sayısı kadar sorgu → 1 sorgu. (Ayrıntı: §4.2)</w:t>
+      </w:r>
+    </w:p>
+    <w:p>
+      <w:pPr>
+        <w:pStyle w:val="FirstParagraph"/>
+      </w:pPr>
+      <w:r>
+        <w:rPr>
+          <w:bCs/>
+          <w:b/>
+        </w:rPr>
+        <w:t xml:space="preserve">Uygulanmayan</w:t>
+      </w:r>
+      <w:r>
+        <w:t xml:space="preserve"> </w:t>
+      </w:r>
+      <w:r>
+        <w:t xml:space="preserve">iyileştirmeler (ya mevcut Flutter istemcisini kırar, ya mimari büyük değişikliktir)</w:t>
+      </w:r>
+      <w:r>
+        <w:t xml:space="preserve"> </w:t>
+      </w:r>
+      <w:r>
+        <w:rPr>
+          <w:bCs/>
+          <w:b/>
+        </w:rPr>
+        <w:t xml:space="preserve">onaya sunulan öneriler</w:t>
+      </w:r>
+      <w:r>
+        <w:t xml:space="preserve"> </w:t>
+      </w:r>
+      <w:r>
+        <w:t xml:space="preserve">olarak §8’de kalıcı risk olarak listelenmiştir (zarf standardizasyonu, Redis pub/sub).</w:t>
       </w:r>
     </w:p>
     <w:p>
@@ -4735,14 +4583,14 @@
         </w:pict>
       </w:r>
     </w:p>
-    <w:bookmarkEnd w:id="47"/>
-    <w:bookmarkStart w:id="48" w:name="flutter-tarafinin-yapmasi-gerekenler"/>
+    <w:bookmarkEnd w:id="46"/>
+    <w:bookmarkStart w:id="47" w:name="düzeltilmeyen-riskler-kalıcı"/>
     <w:p>
       <w:pPr>
         <w:pStyle w:val="Heading2"/>
       </w:pPr>
       <w:r>
-        <w:t xml:space="preserve">9. FLUTTER TARAFININ YAPMASI GEREKENLER</w:t>
+        <w:t xml:space="preserve">8. DÜZELTİLMEYEN RİSKLER (Kalıcı)</w:t>
       </w:r>
     </w:p>
     <w:p>
@@ -4758,82 +4606,13 @@
           <w:bCs/>
           <w:b/>
         </w:rPr>
-        <w:t xml:space="preserve">Hediye tekilleştirme (EN KRİTİK):</w:t>
-      </w:r>
-      <w:r>
-        <w:t xml:space="preserve"> </w:t>
-      </w:r>
-      <w:r>
-        <w:t xml:space="preserve">Her hediye 2–3 SSE mesajı üretir.</w:t>
-      </w:r>
-      <w:r>
-        <w:t xml:space="preserve"> </w:t>
-      </w:r>
-      <w:r>
-        <w:rPr>
-          <w:rStyle w:val="VerbatimChar"/>
-        </w:rPr>
-        <w:t xml:space="preserve">engine === true</w:t>
-      </w:r>
-      <w:r>
-        <w:t xml:space="preserve"> </w:t>
-      </w:r>
-      <w:r>
-        <w:t xml:space="preserve">ile ayrıştır; aynı hediyeyi yalnızca bir kez göster (önerilen: motor</w:t>
-      </w:r>
-      <w:r>
-        <w:t xml:space="preserve"> </w:t>
-      </w:r>
-      <w:r>
-        <w:rPr>
-          <w:rStyle w:val="VerbatimChar"/>
-        </w:rPr>
-        <w:t xml:space="preserve">gift_received</w:t>
-      </w:r>
-      <w:r>
-        <w:t xml:space="preserve">’i kullan, legacy’yi yok say). Motor olaylarını</w:t>
-      </w:r>
-      <w:r>
-        <w:t xml:space="preserve"> </w:t>
-      </w:r>
-      <w:r>
-        <w:rPr>
-          <w:rStyle w:val="VerbatimChar"/>
-        </w:rPr>
-        <w:t xml:space="preserve">event</w:t>
-      </w:r>
-      <w:r>
-        <w:t xml:space="preserve"> </w:t>
-      </w:r>
-      <w:r>
-        <w:t xml:space="preserve">alanına göre yönet (</w:t>
-      </w:r>
-      <w:r>
-        <w:rPr>
-          <w:rStyle w:val="VerbatimChar"/>
-        </w:rPr>
-        <w:t xml:space="preserve">gift_received</w:t>
-      </w:r>
-      <w:r>
-        <w:t xml:space="preserve">/</w:t>
-      </w:r>
-      <w:r>
-        <w:rPr>
-          <w:rStyle w:val="VerbatimChar"/>
-        </w:rPr>
-        <w:t xml:space="preserve">gift_queue_updated</w:t>
-      </w:r>
-      <w:r>
-        <w:t xml:space="preserve">/</w:t>
-      </w:r>
-      <w:r>
-        <w:rPr>
-          <w:rStyle w:val="VerbatimChar"/>
-        </w:rPr>
-        <w:t xml:space="preserve">gift_finished</w:t>
-      </w:r>
-      <w:r>
-        <w:t xml:space="preserve">).</w:t>
+        <w:t xml:space="preserve">In-memory olay yolu örnek-başınadır</w:t>
+      </w:r>
+      <w:r>
+        <w:t xml:space="preserve"> </w:t>
+      </w:r>
+      <w:r>
+        <w:t xml:space="preserve">— yatay ölçeklemede SSE olay kaybı riski. Çözüm: Redis pub/sub (büyük değişiklik, onay gerekir).</w:t>
       </w:r>
     </w:p>
     <w:p>
@@ -4849,37 +4628,28 @@
           <w:bCs/>
           <w:b/>
         </w:rPr>
-        <w:t xml:space="preserve">Olay sıralaması:</w:t>
-      </w:r>
-      <w:r>
-        <w:t xml:space="preserve"> </w:t>
-      </w:r>
-      <w:r>
-        <w:t xml:space="preserve">Farklı tipteki SSE olayları arasında mutlak kronolojik sıraya güvenme; gerekiyorsa payload</w:t>
-      </w:r>
-      <w:r>
-        <w:t xml:space="preserve"> </w:t>
-      </w:r>
-      <w:r>
-        <w:rPr>
-          <w:rStyle w:val="VerbatimChar"/>
-        </w:rPr>
-        <w:t xml:space="preserve">timestamp</w:t>
-      </w:r>
-      <w:r>
-        <w:t xml:space="preserve">/</w:t>
-      </w:r>
-      <w:r>
-        <w:rPr>
-          <w:rStyle w:val="VerbatimChar"/>
-        </w:rPr>
-        <w:t xml:space="preserve">createdAt</w:t>
-      </w:r>
-      <w:r>
-        <w:t xml:space="preserve"> </w:t>
-      </w:r>
-      <w:r>
-        <w:t xml:space="preserve">ile istemcide sırala.</w:t>
+        <w:t xml:space="preserve">API yanıt zarfı tutarsızlığı</w:t>
+      </w:r>
+      <w:r>
+        <w:t xml:space="preserve"> </w:t>
+      </w:r>
+      <w:r>
+        <w:t xml:space="preserve">— ~287 endpoint standart zarf kullanmaz. Mevcut Flutter buna göre yazıldığı için düzeltilmedi; yeni uçlarda</w:t>
+      </w:r>
+      <w:r>
+        <w:t xml:space="preserve"> </w:t>
+      </w:r>
+      <w:r>
+        <w:rPr>
+          <w:rStyle w:val="VerbatimChar"/>
+        </w:rPr>
+        <w:t xml:space="preserve">lib/api-response.ts</w:t>
+      </w:r>
+      <w:r>
+        <w:t xml:space="preserve"> </w:t>
+      </w:r>
+      <w:r>
+        <w:t xml:space="preserve">kullanılmalı.</w:t>
       </w:r>
     </w:p>
     <w:p>
@@ -4895,43 +4665,28 @@
           <w:bCs/>
           <w:b/>
         </w:rPr>
-        <w:t xml:space="preserve">SSE reconnect:</w:t>
-      </w:r>
-      <w:r>
-        <w:t xml:space="preserve"> </w:t>
-      </w:r>
-      <w:r>
-        <w:t xml:space="preserve">Kopmada son alınan olay id’sini</w:t>
-      </w:r>
-      <w:r>
-        <w:t xml:space="preserve"> </w:t>
-      </w:r>
-      <w:r>
-        <w:rPr>
-          <w:rStyle w:val="VerbatimChar"/>
-        </w:rPr>
-        <w:t xml:space="preserve">Last-Event-ID</w:t>
-      </w:r>
-      <w:r>
-        <w:t xml:space="preserve"> </w:t>
-      </w:r>
-      <w:r>
-        <w:t xml:space="preserve">başlığı veya</w:t>
-      </w:r>
-      <w:r>
-        <w:t xml:space="preserve"> </w:t>
-      </w:r>
-      <w:r>
-        <w:rPr>
-          <w:rStyle w:val="VerbatimChar"/>
-        </w:rPr>
-        <w:t xml:space="preserve">?lastEventId=</w:t>
-      </w:r>
-      <w:r>
-        <w:t xml:space="preserve"> </w:t>
-      </w:r>
-      <w:r>
-        <w:t xml:space="preserve">ile geri gönder — TTL penceresi içindeki kaçırılan olaylar tekrar alınır.</w:t>
+        <w:t xml:space="preserve">Poll penceresi içi tipler-arası sıralama garantisi yok</w:t>
+      </w:r>
+      <w:r>
+        <w:t xml:space="preserve"> </w:t>
+      </w:r>
+      <w:r>
+        <w:t xml:space="preserve">— Flutter kronolojik sırayı payload</w:t>
+      </w:r>
+      <w:r>
+        <w:t xml:space="preserve"> </w:t>
+      </w:r>
+      <w:r>
+        <w:rPr>
+          <w:rStyle w:val="VerbatimChar"/>
+        </w:rPr>
+        <w:t xml:space="preserve">timestamp</w:t>
+      </w:r>
+      <w:r>
+        <w:t xml:space="preserve"> </w:t>
+      </w:r>
+      <w:r>
+        <w:t xml:space="preserve">alanından türetmeli.</w:t>
       </w:r>
     </w:p>
     <w:p>
@@ -4947,182 +4702,13 @@
           <w:bCs/>
           <w:b/>
         </w:rPr>
-        <w:t xml:space="preserve">Heartbeat:</w:t>
-      </w:r>
-      <w:r>
-        <w:t xml:space="preserve"> </w:t>
-      </w:r>
-      <w:r>
-        <w:t xml:space="preserve">15 sn’de bir</w:t>
-      </w:r>
-      <w:r>
-        <w:t xml:space="preserve"> </w:t>
-      </w:r>
-      <w:r>
-        <w:rPr>
-          <w:rStyle w:val="VerbatimChar"/>
-        </w:rPr>
-        <w:t xml:space="preserve">: heartbeat</w:t>
-      </w:r>
-      <w:r>
-        <w:t xml:space="preserve"> </w:t>
-      </w:r>
-      <w:r>
-        <w:t xml:space="preserve">satırı gelir; bunu bağlantı canlılık göstergesi olarak kullan, timeout’u buna göre ayarla (örn. 30–45 sn).</w:t>
-      </w:r>
-    </w:p>
-    <w:p>
-      <w:pPr>
-        <w:numPr>
-          <w:ilvl w:val="0"/>
-          <w:numId w:val="1018"/>
-        </w:numPr>
-        <w:pStyle w:val="Compact"/>
-      </w:pPr>
-      <w:r>
-        <w:rPr>
-          <w:bCs/>
-          <w:b/>
-        </w:rPr>
-        <w:t xml:space="preserve">TRTC token yenileme:</w:t>
-      </w:r>
-      <w:r>
-        <w:t xml:space="preserve"> </w:t>
-      </w:r>
-      <w:r>
-        <w:rPr>
-          <w:rStyle w:val="VerbatimChar"/>
-        </w:rPr>
-        <w:t xml:space="preserve">expireTime</w:t>
-      </w:r>
-      <w:r>
-        <w:t xml:space="preserve"> </w:t>
-      </w:r>
-      <w:r>
-        <w:t xml:space="preserve">(varsayılan 24 saat) dolmadan</w:t>
-      </w:r>
-      <w:r>
-        <w:t xml:space="preserve"> </w:t>
-      </w:r>
-      <w:r>
-        <w:rPr>
-          <w:rStyle w:val="VerbatimChar"/>
-        </w:rPr>
-        <w:t xml:space="preserve">/api/trtc/token</w:t>
-      </w:r>
-      <w:r>
-        <w:t xml:space="preserve">’ı tekrar çağırıp yeni</w:t>
-      </w:r>
-      <w:r>
-        <w:t xml:space="preserve"> </w:t>
-      </w:r>
-      <w:r>
-        <w:rPr>
-          <w:rStyle w:val="VerbatimChar"/>
-        </w:rPr>
-        <w:t xml:space="preserve">userSig</w:t>
-      </w:r>
-      <w:r>
-        <w:t xml:space="preserve"> </w:t>
-      </w:r>
-      <w:r>
-        <w:t xml:space="preserve">al. Odaya girişte daima dönen</w:t>
-      </w:r>
-      <w:r>
-        <w:t xml:space="preserve"> </w:t>
-      </w:r>
-      <w:r>
-        <w:rPr>
-          <w:rStyle w:val="VerbatimChar"/>
-        </w:rPr>
-        <w:t xml:space="preserve">trtcRoomId</w:t>
-      </w:r>
-      <w:r>
-        <w:t xml:space="preserve"> </w:t>
-      </w:r>
-      <w:r>
-        <w:t xml:space="preserve">(</w:t>
-      </w:r>
-      <w:r>
-        <w:rPr>
-          <w:rStyle w:val="VerbatimChar"/>
-        </w:rPr>
-        <w:t xml:space="preserve">voice_room_&lt;id&gt;</w:t>
-      </w:r>
-      <w:r>
-        <w:t xml:space="preserve">) değerini kullan — kendi oda id’ini üretme.</w:t>
-      </w:r>
-    </w:p>
-    <w:p>
-      <w:pPr>
-        <w:numPr>
-          <w:ilvl w:val="0"/>
-          <w:numId w:val="1018"/>
-        </w:numPr>
-        <w:pStyle w:val="Compact"/>
-      </w:pPr>
-      <w:r>
-        <w:rPr>
-          <w:bCs/>
-          <w:b/>
-        </w:rPr>
-        <w:t xml:space="preserve">Voice ping:</w:t>
-      </w:r>
-      <w:r>
-        <w:t xml:space="preserve"> </w:t>
-      </w:r>
-      <w:r>
-        <w:t xml:space="preserve">Voice oturumunu canlı tutmak için düzenli olarak (30 sn’den kısa aralıkla) voice GET çağır; aksi halde oturum bayat sayılıp temizlenir.</w:t>
-      </w:r>
-    </w:p>
-    <w:p>
-      <w:pPr>
-        <w:numPr>
-          <w:ilvl w:val="0"/>
-          <w:numId w:val="1018"/>
-        </w:numPr>
-        <w:pStyle w:val="Compact"/>
-      </w:pPr>
-      <w:r>
-        <w:rPr>
-          <w:bCs/>
-          <w:b/>
-        </w:rPr>
-        <w:t xml:space="preserve">Yanıt şekilleri:</w:t>
-      </w:r>
-      <w:r>
-        <w:t xml:space="preserve"> </w:t>
-      </w:r>
-      <w:r>
-        <w:t xml:space="preserve">Her endpoint’in kendi şekline göre parse et; API genelinde tek tip zarf</w:t>
-      </w:r>
-      <w:r>
-        <w:t xml:space="preserve"> </w:t>
-      </w:r>
-      <w:r>
-        <w:rPr>
-          <w:bCs/>
-          <w:b/>
-        </w:rPr>
-        <w:t xml:space="preserve">varsayma</w:t>
-      </w:r>
-      <w:r>
-        <w:t xml:space="preserve"> </w:t>
-      </w:r>
-      <w:r>
-        <w:t xml:space="preserve">(dokümantasyondaki</w:t>
-      </w:r>
-      <w:r>
-        <w:t xml:space="preserve"> </w:t>
-      </w:r>
-      <w:r>
-        <w:rPr>
-          <w:rStyle w:val="VerbatimChar"/>
-        </w:rPr>
-        <w:t xml:space="preserve">FLUTTER_API_REFERENCE</w:t>
-      </w:r>
-      <w:r>
-        <w:t xml:space="preserve">’a uy).</w:t>
+        <w:t xml:space="preserve">Denetim kapsamı:</w:t>
+      </w:r>
+      <w:r>
+        <w:t xml:space="preserve"> </w:t>
+      </w:r>
+      <w:r>
+        <w:t xml:space="preserve">487 endpoint’in tamamı canlı ortamda çalıştırılarak test edilmemiştir; kritik gerçek zamanlı/hediye/TRTC/DB yolları kod düzeyinde doğrulanmıştır.</w:t>
       </w:r>
     </w:p>
     <w:p>
@@ -5132,6 +4718,403 @@
         </w:pict>
       </w:r>
     </w:p>
+    <w:bookmarkEnd w:id="47"/>
+    <w:bookmarkStart w:id="48" w:name="flutter-tarafinin-yapmasi-gerekenler"/>
+    <w:p>
+      <w:pPr>
+        <w:pStyle w:val="Heading2"/>
+      </w:pPr>
+      <w:r>
+        <w:t xml:space="preserve">9. FLUTTER TARAFININ YAPMASI GEREKENLER</w:t>
+      </w:r>
+    </w:p>
+    <w:p>
+      <w:pPr>
+        <w:numPr>
+          <w:ilvl w:val="0"/>
+          <w:numId w:val="1019"/>
+        </w:numPr>
+        <w:pStyle w:val="Compact"/>
+      </w:pPr>
+      <w:r>
+        <w:rPr>
+          <w:bCs/>
+          <w:b/>
+        </w:rPr>
+        <w:t xml:space="preserve">Hediye tekilleştirme (EN KRİTİK):</w:t>
+      </w:r>
+      <w:r>
+        <w:t xml:space="preserve"> </w:t>
+      </w:r>
+      <w:r>
+        <w:t xml:space="preserve">Her hediye 2–3 SSE mesajı üretir.</w:t>
+      </w:r>
+      <w:r>
+        <w:t xml:space="preserve"> </w:t>
+      </w:r>
+      <w:r>
+        <w:rPr>
+          <w:rStyle w:val="VerbatimChar"/>
+        </w:rPr>
+        <w:t xml:space="preserve">engine === true</w:t>
+      </w:r>
+      <w:r>
+        <w:t xml:space="preserve"> </w:t>
+      </w:r>
+      <w:r>
+        <w:t xml:space="preserve">ile ayrıştır; aynı hediyeyi yalnızca bir kez göster (önerilen: motor</w:t>
+      </w:r>
+      <w:r>
+        <w:t xml:space="preserve"> </w:t>
+      </w:r>
+      <w:r>
+        <w:rPr>
+          <w:rStyle w:val="VerbatimChar"/>
+        </w:rPr>
+        <w:t xml:space="preserve">gift_received</w:t>
+      </w:r>
+      <w:r>
+        <w:t xml:space="preserve">’i kullan, legacy’yi yok say). Motor olaylarını</w:t>
+      </w:r>
+      <w:r>
+        <w:t xml:space="preserve"> </w:t>
+      </w:r>
+      <w:r>
+        <w:rPr>
+          <w:rStyle w:val="VerbatimChar"/>
+        </w:rPr>
+        <w:t xml:space="preserve">event</w:t>
+      </w:r>
+      <w:r>
+        <w:t xml:space="preserve"> </w:t>
+      </w:r>
+      <w:r>
+        <w:t xml:space="preserve">alanına göre yönet (</w:t>
+      </w:r>
+      <w:r>
+        <w:rPr>
+          <w:rStyle w:val="VerbatimChar"/>
+        </w:rPr>
+        <w:t xml:space="preserve">gift_received</w:t>
+      </w:r>
+      <w:r>
+        <w:t xml:space="preserve">/</w:t>
+      </w:r>
+      <w:r>
+        <w:rPr>
+          <w:rStyle w:val="VerbatimChar"/>
+        </w:rPr>
+        <w:t xml:space="preserve">gift_queue_updated</w:t>
+      </w:r>
+      <w:r>
+        <w:t xml:space="preserve">/</w:t>
+      </w:r>
+      <w:r>
+        <w:rPr>
+          <w:rStyle w:val="VerbatimChar"/>
+        </w:rPr>
+        <w:t xml:space="preserve">gift_finished</w:t>
+      </w:r>
+      <w:r>
+        <w:t xml:space="preserve">).</w:t>
+      </w:r>
+    </w:p>
+    <w:p>
+      <w:pPr>
+        <w:numPr>
+          <w:ilvl w:val="0"/>
+          <w:numId w:val="1019"/>
+        </w:numPr>
+        <w:pStyle w:val="Compact"/>
+      </w:pPr>
+      <w:r>
+        <w:rPr>
+          <w:bCs/>
+          <w:b/>
+        </w:rPr>
+        <w:t xml:space="preserve">Olay sıralaması:</w:t>
+      </w:r>
+      <w:r>
+        <w:t xml:space="preserve"> </w:t>
+      </w:r>
+      <w:r>
+        <w:t xml:space="preserve">Farklı tipteki SSE olayları arasında mutlak kronolojik sıraya güvenme; gerekiyorsa payload</w:t>
+      </w:r>
+      <w:r>
+        <w:t xml:space="preserve"> </w:t>
+      </w:r>
+      <w:r>
+        <w:rPr>
+          <w:rStyle w:val="VerbatimChar"/>
+        </w:rPr>
+        <w:t xml:space="preserve">timestamp</w:t>
+      </w:r>
+      <w:r>
+        <w:t xml:space="preserve">/</w:t>
+      </w:r>
+      <w:r>
+        <w:rPr>
+          <w:rStyle w:val="VerbatimChar"/>
+        </w:rPr>
+        <w:t xml:space="preserve">createdAt</w:t>
+      </w:r>
+      <w:r>
+        <w:t xml:space="preserve"> </w:t>
+      </w:r>
+      <w:r>
+        <w:t xml:space="preserve">ile istemcide sırala.</w:t>
+      </w:r>
+    </w:p>
+    <w:p>
+      <w:pPr>
+        <w:numPr>
+          <w:ilvl w:val="0"/>
+          <w:numId w:val="1019"/>
+        </w:numPr>
+        <w:pStyle w:val="Compact"/>
+      </w:pPr>
+      <w:r>
+        <w:rPr>
+          <w:bCs/>
+          <w:b/>
+        </w:rPr>
+        <w:t xml:space="preserve">SSE reconnect:</w:t>
+      </w:r>
+      <w:r>
+        <w:t xml:space="preserve"> </w:t>
+      </w:r>
+      <w:r>
+        <w:t xml:space="preserve">Kopmada son alınan olay id’sini</w:t>
+      </w:r>
+      <w:r>
+        <w:t xml:space="preserve"> </w:t>
+      </w:r>
+      <w:r>
+        <w:rPr>
+          <w:rStyle w:val="VerbatimChar"/>
+        </w:rPr>
+        <w:t xml:space="preserve">Last-Event-ID</w:t>
+      </w:r>
+      <w:r>
+        <w:t xml:space="preserve"> </w:t>
+      </w:r>
+      <w:r>
+        <w:t xml:space="preserve">başlığı veya</w:t>
+      </w:r>
+      <w:r>
+        <w:t xml:space="preserve"> </w:t>
+      </w:r>
+      <w:r>
+        <w:rPr>
+          <w:rStyle w:val="VerbatimChar"/>
+        </w:rPr>
+        <w:t xml:space="preserve">?lastEventId=</w:t>
+      </w:r>
+      <w:r>
+        <w:t xml:space="preserve"> </w:t>
+      </w:r>
+      <w:r>
+        <w:t xml:space="preserve">ile geri gönder — TTL penceresi içindeki kaçırılan olaylar tekrar alınır.</w:t>
+      </w:r>
+    </w:p>
+    <w:p>
+      <w:pPr>
+        <w:numPr>
+          <w:ilvl w:val="0"/>
+          <w:numId w:val="1019"/>
+        </w:numPr>
+        <w:pStyle w:val="Compact"/>
+      </w:pPr>
+      <w:r>
+        <w:rPr>
+          <w:bCs/>
+          <w:b/>
+        </w:rPr>
+        <w:t xml:space="preserve">Heartbeat:</w:t>
+      </w:r>
+      <w:r>
+        <w:t xml:space="preserve"> </w:t>
+      </w:r>
+      <w:r>
+        <w:t xml:space="preserve">15 sn’de bir</w:t>
+      </w:r>
+      <w:r>
+        <w:t xml:space="preserve"> </w:t>
+      </w:r>
+      <w:r>
+        <w:rPr>
+          <w:rStyle w:val="VerbatimChar"/>
+        </w:rPr>
+        <w:t xml:space="preserve">: heartbeat</w:t>
+      </w:r>
+      <w:r>
+        <w:t xml:space="preserve"> </w:t>
+      </w:r>
+      <w:r>
+        <w:t xml:space="preserve">satırı gelir; bunu bağlantı canlılık göstergesi olarak kullan, timeout’u buna göre ayarla (örn. 30–45 sn).</w:t>
+      </w:r>
+    </w:p>
+    <w:p>
+      <w:pPr>
+        <w:numPr>
+          <w:ilvl w:val="0"/>
+          <w:numId w:val="1019"/>
+        </w:numPr>
+        <w:pStyle w:val="Compact"/>
+      </w:pPr>
+      <w:r>
+        <w:rPr>
+          <w:bCs/>
+          <w:b/>
+        </w:rPr>
+        <w:t xml:space="preserve">TRTC token yenileme:</w:t>
+      </w:r>
+      <w:r>
+        <w:t xml:space="preserve"> </w:t>
+      </w:r>
+      <w:r>
+        <w:rPr>
+          <w:rStyle w:val="VerbatimChar"/>
+        </w:rPr>
+        <w:t xml:space="preserve">expireTime</w:t>
+      </w:r>
+      <w:r>
+        <w:t xml:space="preserve"> </w:t>
+      </w:r>
+      <w:r>
+        <w:t xml:space="preserve">(varsayılan 24 saat) dolmadan</w:t>
+      </w:r>
+      <w:r>
+        <w:t xml:space="preserve"> </w:t>
+      </w:r>
+      <w:r>
+        <w:rPr>
+          <w:rStyle w:val="VerbatimChar"/>
+        </w:rPr>
+        <w:t xml:space="preserve">/api/trtc/token</w:t>
+      </w:r>
+      <w:r>
+        <w:t xml:space="preserve">’ı tekrar çağırıp yeni</w:t>
+      </w:r>
+      <w:r>
+        <w:t xml:space="preserve"> </w:t>
+      </w:r>
+      <w:r>
+        <w:rPr>
+          <w:rStyle w:val="VerbatimChar"/>
+        </w:rPr>
+        <w:t xml:space="preserve">userSig</w:t>
+      </w:r>
+      <w:r>
+        <w:t xml:space="preserve"> </w:t>
+      </w:r>
+      <w:r>
+        <w:t xml:space="preserve">al. Odaya girişte daima dönen</w:t>
+      </w:r>
+      <w:r>
+        <w:t xml:space="preserve"> </w:t>
+      </w:r>
+      <w:r>
+        <w:rPr>
+          <w:rStyle w:val="VerbatimChar"/>
+        </w:rPr>
+        <w:t xml:space="preserve">trtcRoomId</w:t>
+      </w:r>
+      <w:r>
+        <w:t xml:space="preserve"> </w:t>
+      </w:r>
+      <w:r>
+        <w:t xml:space="preserve">(</w:t>
+      </w:r>
+      <w:r>
+        <w:rPr>
+          <w:rStyle w:val="VerbatimChar"/>
+        </w:rPr>
+        <w:t xml:space="preserve">voice_room_&lt;id&gt;</w:t>
+      </w:r>
+      <w:r>
+        <w:t xml:space="preserve">) değerini kullan — kendi oda id’ini üretme.</w:t>
+      </w:r>
+    </w:p>
+    <w:p>
+      <w:pPr>
+        <w:numPr>
+          <w:ilvl w:val="0"/>
+          <w:numId w:val="1019"/>
+        </w:numPr>
+        <w:pStyle w:val="Compact"/>
+      </w:pPr>
+      <w:r>
+        <w:rPr>
+          <w:bCs/>
+          <w:b/>
+        </w:rPr>
+        <w:t xml:space="preserve">Voice ping:</w:t>
+      </w:r>
+      <w:r>
+        <w:t xml:space="preserve"> </w:t>
+      </w:r>
+      <w:r>
+        <w:t xml:space="preserve">Voice oturumunu canlı tutmak için düzenli olarak (30 sn’den kısa aralıkla) voice GET çağır; aksi halde oturum bayat sayılıp temizlenir.</w:t>
+      </w:r>
+    </w:p>
+    <w:p>
+      <w:pPr>
+        <w:numPr>
+          <w:ilvl w:val="0"/>
+          <w:numId w:val="1019"/>
+        </w:numPr>
+        <w:pStyle w:val="Compact"/>
+      </w:pPr>
+      <w:r>
+        <w:rPr>
+          <w:bCs/>
+          <w:b/>
+        </w:rPr>
+        <w:t xml:space="preserve">Yanıt şekilleri:</w:t>
+      </w:r>
+      <w:r>
+        <w:t xml:space="preserve"> </w:t>
+      </w:r>
+      <w:r>
+        <w:t xml:space="preserve">Her endpoint’in kendi şekline göre parse et; API genelinde tek tip zarf</w:t>
+      </w:r>
+      <w:r>
+        <w:t xml:space="preserve"> </w:t>
+      </w:r>
+      <w:r>
+        <w:rPr>
+          <w:bCs/>
+          <w:b/>
+        </w:rPr>
+        <w:t xml:space="preserve">varsayma</w:t>
+      </w:r>
+      <w:r>
+        <w:t xml:space="preserve"> </w:t>
+      </w:r>
+      <w:r>
+        <w:t xml:space="preserve">(dokümantasyondaki</w:t>
+      </w:r>
+      <w:r>
+        <w:t xml:space="preserve"> </w:t>
+      </w:r>
+      <w:r>
+        <w:rPr>
+          <w:rStyle w:val="VerbatimChar"/>
+        </w:rPr>
+        <w:t xml:space="preserve">FLUTTER_API_REFERENCE</w:t>
+      </w:r>
+      <w:r>
+        <w:t xml:space="preserve">’a uy).</w:t>
+      </w:r>
+    </w:p>
+    <w:p>
+      <w:r>
+        <w:pict>
+          <v:rect style="width:0;height:1.5pt" o:hralign="center" o:hrstd="t" o:hr="t"/>
+        </w:pict>
+      </w:r>
+    </w:p>
     <w:bookmarkEnd w:id="48"/>
     <w:bookmarkStart w:id="49" w:name="sonuç"/>
     <w:p>
@@ -5163,7 +5146,7 @@
         <w:t xml:space="preserve"> </w:t>
       </w:r>
       <w:r>
-        <w:t xml:space="preserve">Kritik yollar (gerçek zamanlı akış, TRTC yaşam döngüsü, hediye motoru, veritabanı) sağlam ve optimize durumdadır. Tam</w:t>
+        <w:t xml:space="preserve">Kritik yollar (gerçek zamanlı akış, TRTC yaşam döngüsü, hediye motoru, veritabanı) sağlam ve optimize durumdadır. chat-room hediye para yolu atomik hale getirildi (§5.4) ve mesaj kutusu N+1 sorgusu giderildi (§4.2). Tam</w:t>
       </w:r>
       <w:r>
         <w:t xml:space="preserve"> </w:t>
@@ -5181,7 +5164,7 @@
         <w:t xml:space="preserve"> </w:t>
       </w:r>
       <w:r>
-        <w:t xml:space="preserve">için önerilen adımlar: (1) Flutter tarafının §9’daki kuralları uygulaması, (2) onayınızla chat-room hediye para yolunun atomik hale getirilmesi (§5.4), (3) ölçekleme planlanıyorsa in-memory olay yolunun Redis pub/sub’a taşınması (§8.1).</w:t>
+        <w:t xml:space="preserve">için kalan adımlar: (1) Flutter tarafının §9’daki kuralları uygulaması, (2) ölçekleme planlanıyorsa in-memory olay yolunun Redis pub/sub’a taşınması (§8.1).</w:t>
       </w:r>
     </w:p>
     <w:p>
@@ -5189,7 +5172,23 @@
         <w:pStyle w:val="BodyText"/>
       </w:pPr>
       <w:r>
-        <w:t xml:space="preserve">Yukarıdaki §9 (Flutter) ve §5.4 (para yolu) maddeleri tamamlandığında backend, tek örnekli dağıtımda Flutter ile tam uyumlu kabul edilebilir.</w:t>
+        <w:t xml:space="preserve">§5.4 (para yolu atomikliği) ve §4.2 (N+1) artık</w:t>
+      </w:r>
+      <w:r>
+        <w:t xml:space="preserve"> </w:t>
+      </w:r>
+      <w:r>
+        <w:rPr>
+          <w:bCs/>
+          <w:b/>
+        </w:rPr>
+        <w:t xml:space="preserve">tamamlandı.</w:t>
+      </w:r>
+      <w:r>
+        <w:t xml:space="preserve"> </w:t>
+      </w:r>
+      <w:r>
+        <w:t xml:space="preserve">Geriye kalan tek koşul §9’daki Flutter tarafı uyarlamalarıdır; bunlar tamamlandığında backend, tek örnekli dağıtımda Flutter ile tam uyumlu kabul edilebilir.</w:t>
       </w:r>
     </w:p>
     <w:bookmarkEnd w:id="49"/>
@@ -5543,6 +5542,36 @@
     </w:lvlOverride>
   </w:num>
   <w:num w:numId="1018">
+    <w:abstractNumId w:val="99411"/>
+    <w:lvlOverride w:ilvl="0">
+      <w:startOverride w:val="1"/>
+    </w:lvlOverride>
+    <w:lvlOverride w:ilvl="1">
+      <w:startOverride w:val="1"/>
+    </w:lvlOverride>
+    <w:lvlOverride w:ilvl="2">
+      <w:startOverride w:val="1"/>
+    </w:lvlOverride>
+    <w:lvlOverride w:ilvl="3">
+      <w:startOverride w:val="1"/>
+    </w:lvlOverride>
+    <w:lvlOverride w:ilvl="4">
+      <w:startOverride w:val="1"/>
+    </w:lvlOverride>
+    <w:lvlOverride w:ilvl="5">
+      <w:startOverride w:val="1"/>
+    </w:lvlOverride>
+    <w:lvlOverride w:ilvl="6">
+      <w:startOverride w:val="1"/>
+    </w:lvlOverride>
+    <w:lvlOverride w:ilvl="7">
+      <w:startOverride w:val="1"/>
+    </w:lvlOverride>
+    <w:lvlOverride w:ilvl="8">
+      <w:startOverride w:val="1"/>
+    </w:lvlOverride>
+  </w:num>
+  <w:num w:numId="1019">
     <w:abstractNumId w:val="99411"/>
     <w:lvlOverride w:ilvl="0">
       <w:startOverride w:val="1"/>

</xml_diff>